<commit_message>
Release: dateline Miami, matching the submitted copy; no placeholders remain
</commit_message>
<xml_diff>
--- a/docs/press/2026-10-20-florida-release.docx
+++ b/docs/press/2026-10-20-florida-release.docx
@@ -26,7 +26,7 @@
         <w:rPr>
           <w:b/>
         </w:rPr>
-        <w:t xml:space="preserve">[CITY], Fla., Oct. 20, 2026 /PRNewswire/ -- </w:t>
+        <w:t xml:space="preserve">MIAMI, Fla., Oct. 20, 2026 /PRNewswire/ -- </w:t>
       </w:r>
       <w:r>
         <w:t>Of 81 Florida-headquartered banks and credit unions, 54 already protect their customers' connections against future quantum decryption and 27 do not yet, according to a state-of-readiness note published today by Manteiga Foundation, a Florida public benefit company. The note, the first from the foundation's Quantum Ready Labs, lists every institution and its result: quantumreadylabs.com/studies/florida-financial-2026q4.</w:t>
@@ -175,7 +175,7 @@
         <w:pStyle w:val="Note"/>
       </w:pPr>
       <w:r>
-        <w:t>Placeholder left to fill before submission: [CITY] in the dateline. Name, title and contact are in.</w:t>
+        <w:t>No placeholders remain: dateline Miami, name, title and contact are in. Submitted and scheduled 19 October 2026.</w:t>
       </w:r>
     </w:p>
     <w:p>

</xml_diff>